<commit_message>
Week 4: merge deck, update parts list and Week 4 report
- Deck: resolve pptx conflict — keep contributor's Alexis Perez slide and
  re-apply Ethan's hardware-purchase bullet to the Ethan Wells slide
- Parts list: add CR2032 RTC battery (Ordered) and motor controller (TBD);
  ultrasonic sensor -> Have; NVMe boot SSD -> Ordered
- Week 4 report: regenerate docx/pdf with Week 4 data (Ethan filled,
  teammates placeholdered)
- build_report.py: fix Weekly Summary heading being blanked (runs identity
  bug); support undated/hourless contribution entries
- context.md: document the Week N/ archive structure and rolling pptx
</commit_message>
<xml_diff>
--- a/Weekly Reports/Self_Driving_RC_Car.docx
+++ b/Weekly Reports/Self_Driving_RC_Car.docx
@@ -67,7 +67,7 @@
           <w:sz w:val="24"/>
           <w:szCs w:val="24"/>
         </w:rPr>
-        <w:t>9/8/2026</w:t>
+        <w:t>9/15/2026</w:t>
       </w:r>
       <w:r>
         <w:rPr>
@@ -277,6 +277,7 @@
           <w:szCs w:val="24"/>
           <w:u w:val="single"/>
         </w:rPr>
+        <w:t>Weekly Summary (9/15/2026):</w:t>
       </w:r>
     </w:p>
     <w:p>
@@ -297,7 +298,7 @@
         <w:rPr>
           <w:sz w:val="24"/>
         </w:rPr>
-        <w:t xml:space="preserve">This week the team moved into buying hardware and starting on the software side. We bought the Raspberry Pi Compute Module I/O Board, which came in this week, so we have a board to prototype the CM5 carrier design on. Abigail drew up the schematic Professor Nguyen asked for. We also ordered the rest of the core sensors: an ultrasonic sensor for measuring distance to obstacles and walls, an IMU for tracking heading and turns, and the camera that reads the traffic signs. Ethan Wells started researching how to train the traffic-sign model in TensorFlow, which is the framework the proposal calls for, and set up a GitHub repository to hold the training code. As a group we settled on standing weekly meeting times in the Robotics Lab in the Delta Building: Mondays 4:00 to 7:00 PM, Wednesdays 1:00 to 6:00 PM, and Thursdays 10:00 AM to 12:00 PM.</w:t>
+        <w:t xml:space="preserve">This week Ethan Wells completed the traffic-sign model milestone from last week's plan: he trained a convolutional neural network on the GTSRB German traffic-sign dataset to about 95% validation accuracy, and committed both the trained model and the training script to the project repository, working in a Python 3.12 environment (the version TensorFlow currently supports). Updates from the rest of the team on the ultrasonic sensor, IMU, and camera/schematic work are pending and will be added before submission.</w:t>
       </w:r>
     </w:p>
     <w:p>
@@ -341,7 +342,7 @@
         <w:rPr>
           <w:sz w:val="24"/>
         </w:rPr>
-        <w:t xml:space="preserve">Get the model trained in TensorFlow on the German traffic-sign dataset (GTSRB) and push the training code to the repo.</w:t>
+        <w:t xml:space="preserve">Prepare the LISA dataset (US traffic signs) for training.</w:t>
       </w:r>
     </w:p>
     <w:p>
@@ -369,7 +370,7 @@
         <w:rPr>
           <w:sz w:val="24"/>
         </w:rPr>
-        <w:t xml:space="preserve">Get the ultrasonic sensor in and test it on the bench, make sure it returns distance readings, and figure out its usable range and how it reads against a wall.</w:t>
+        <w:t xml:space="preserve">[Pending — to be provided]</w:t>
       </w:r>
     </w:p>
     <w:p>
@@ -397,7 +398,7 @@
         <w:rPr>
           <w:sz w:val="24"/>
         </w:rPr>
-        <w:t xml:space="preserve">Get the IMU in and test it on the bench, make sure it reports heading and orientation, and check how noisy the readings are.</w:t>
+        <w:t xml:space="preserve">[Pending — to be provided]</w:t>
       </w:r>
     </w:p>
     <w:p>
@@ -425,7 +426,7 @@
         <w:rPr>
           <w:sz w:val="24"/>
         </w:rPr>
-        <w:t xml:space="preserve">Get the camera in and make sure it captures frames, and rework the schematic based on Professor Nguyen's feedback so it is ready to lay out the carrier board.</w:t>
+        <w:t xml:space="preserve">[Pending — to be provided]</w:t>
       </w:r>
     </w:p>
     <w:p>
@@ -488,7 +489,7 @@
         <w:rPr>
           <w:sz w:val="24"/>
         </w:rPr>
-        <w:t xml:space="preserve">9/8/2026 – Bought the Compute Module I/O Board (it came in this week), started researching how to train the traffic-sign model in TensorFlow, and set up a GitHub repository for the training code (5 hours)</w:t>
+        <w:t xml:space="preserve">9/10/2026 – Built and ran the first CNN training on the GTSRB German traffic-sign dataset in TensorFlow (3 hours)</w:t>
       </w:r>
     </w:p>
     <w:p>
@@ -507,10 +508,9 @@
       <w:proofErr w:type="spellEnd"/>
       <w:r>
         <w:rPr>
-          <w:u w:val="single"/>
-          <w:sz w:val="24"/>
-        </w:rPr>
-        <w:t xml:space="preserve">Alexis Perez:</w:t>
+          <w:sz w:val="24"/>
+        </w:rPr>
+        <w:t xml:space="preserve">9/14/2026 – Tuned the model to ~95% validation accuracy and committed the trained model (gtsrb_model.keras) and training script to the repo (4 hours)</w:t>
       </w:r>
     </w:p>
     <w:p>
@@ -529,9 +529,10 @@
       <w:proofErr w:type="spellEnd"/>
       <w:r>
         <w:rPr>
-          <w:sz w:val="24"/>
-        </w:rPr>
-        <w:t xml:space="preserve">9/7/2026 – Researched ultrasonic sensor options and ordered one to measure distance to obstacles and walls (3 hours)</w:t>
+          <w:u w:val="single"/>
+          <w:sz w:val="24"/>
+        </w:rPr>
+        <w:t xml:space="preserve">Alexis Perez:</w:t>
       </w:r>
     </w:p>
     <w:p>
@@ -550,10 +551,9 @@
       <w:proofErr w:type="spellEnd"/>
       <w:r>
         <w:rPr>
-          <w:u w:val="single"/>
-          <w:sz w:val="24"/>
-        </w:rPr>
-        <w:t xml:space="preserve">Ethan Bishop:</w:t>
+          <w:sz w:val="24"/>
+        </w:rPr>
+        <w:t xml:space="preserve">[Pending — awaiting progress and hours]</w:t>
       </w:r>
     </w:p>
     <w:p>
@@ -572,9 +572,10 @@
       <w:proofErr w:type="spellEnd"/>
       <w:r>
         <w:rPr>
-          <w:sz w:val="24"/>
-        </w:rPr>
-        <w:t xml:space="preserve">9/7/2026 – Researched IMU options and ordered one to track heading and turns (3 hours)</w:t>
+          <w:u w:val="single"/>
+          <w:sz w:val="24"/>
+        </w:rPr>
+        <w:t xml:space="preserve">Ethan Bishop:</w:t>
       </w:r>
     </w:p>
     <w:p>
@@ -593,10 +594,9 @@
       <w:proofErr w:type="spellEnd"/>
       <w:r>
         <w:rPr>
-          <w:u w:val="single"/>
-          <w:sz w:val="24"/>
-        </w:rPr>
-        <w:t xml:space="preserve">Abigail Duran:</w:t>
+          <w:sz w:val="24"/>
+        </w:rPr>
+        <w:t xml:space="preserve">[Pending — awaiting progress and hours]</w:t>
       </w:r>
     </w:p>
     <w:p>
@@ -615,9 +615,10 @@
       <w:proofErr w:type="spellEnd"/>
       <w:r>
         <w:rPr>
-          <w:sz w:val="24"/>
-        </w:rPr>
-        <w:t xml:space="preserve">9/7/2026 – Worked on the schematic Professor Nguyen asked for (2 hours)</w:t>
+          <w:u w:val="single"/>
+          <w:sz w:val="24"/>
+        </w:rPr>
+        <w:t xml:space="preserve">Abigail Duran:</w:t>
       </w:r>
     </w:p>
     <w:p>
@@ -638,7 +639,7 @@
         <w:rPr>
           <w:sz w:val="24"/>
         </w:rPr>
-        <w:t xml:space="preserve">9/8/2026 – Finished the schematic and ordered the camera (3 hours)</w:t>
+        <w:t xml:space="preserve">[Pending — awaiting progress and hours]</w:t>
       </w:r>
     </w:p>
     <w:p>
@@ -878,7 +879,7 @@
               <w:rPr>
                 <w:sz w:val="24"/>
               </w:rPr>
-              <w:t xml:space="preserve">5</w:t>
+              <w:t xml:space="preserve">7</w:t>
             </w:r>
           </w:p>
         </w:tc>
@@ -912,7 +913,7 @@
               <w:rPr>
                 <w:sz w:val="24"/>
               </w:rPr>
-              <w:t xml:space="preserve">5</w:t>
+              <w:t xml:space="preserve">12</w:t>
             </w:r>
           </w:p>
         </w:tc>
@@ -982,7 +983,7 @@
               <w:rPr>
                 <w:sz w:val="24"/>
               </w:rPr>
-              <w:t xml:space="preserve">3</w:t>
+              <w:t xml:space="preserve">TBD</w:t>
             </w:r>
           </w:p>
         </w:tc>
@@ -1016,7 +1017,7 @@
               <w:rPr>
                 <w:sz w:val="24"/>
               </w:rPr>
-              <w:t xml:space="preserve">3</w:t>
+              <w:t xml:space="preserve">TBD</w:t>
             </w:r>
           </w:p>
         </w:tc>
@@ -1086,7 +1087,7 @@
               <w:rPr>
                 <w:sz w:val="24"/>
               </w:rPr>
-              <w:t xml:space="preserve">3</w:t>
+              <w:t xml:space="preserve">TBD</w:t>
             </w:r>
           </w:p>
         </w:tc>
@@ -1120,7 +1121,7 @@
               <w:rPr>
                 <w:sz w:val="24"/>
               </w:rPr>
-              <w:t xml:space="preserve">3</w:t>
+              <w:t xml:space="preserve">TBD</w:t>
             </w:r>
           </w:p>
         </w:tc>
@@ -1190,7 +1191,7 @@
               <w:rPr>
                 <w:sz w:val="24"/>
               </w:rPr>
-              <w:t xml:space="preserve">5</w:t>
+              <w:t xml:space="preserve">TBD</w:t>
             </w:r>
           </w:p>
         </w:tc>
@@ -1224,7 +1225,7 @@
               <w:rPr>
                 <w:sz w:val="24"/>
               </w:rPr>
-              <w:t xml:space="preserve">5</w:t>
+              <w:t xml:space="preserve">TBD</w:t>
             </w:r>
           </w:p>
         </w:tc>

</xml_diff>